<commit_message>
űrlap módosítás, és dokumentáció
</commit_message>
<xml_diff>
--- a/Dokumentáció.docx
+++ b/Dokumentáció.docx
@@ -3,76 +3,194 @@
 <w:document xmlns:wpc="http://schemas.microsoft.com/office/word/2010/wordprocessingCanvas" xmlns:mc="http://schemas.openxmlformats.org/markup-compatibility/2006" xmlns:o="urn:schemas-microsoft-com:office:office" xmlns:r="http://schemas.openxmlformats.org/officeDocument/2006/relationships" xmlns:m="http://schemas.openxmlformats.org/officeDocument/2006/math" xmlns:v="urn:schemas-microsoft-com:vml" xmlns:wp14="http://schemas.microsoft.com/office/word/2010/wordprocessingDrawing" xmlns:wp="http://schemas.openxmlformats.org/drawingml/2006/wordprocessingDrawing" xmlns:w10="urn:schemas-microsoft-com:office:word" xmlns:w="http://schemas.openxmlformats.org/wordprocessingml/2006/main" xmlns:w14="http://schemas.microsoft.com/office/word/2010/wordml" xmlns:w15="http://schemas.microsoft.com/office/word/2012/wordml" xmlns:wpg="http://schemas.microsoft.com/office/word/2010/wordprocessingGroup" xmlns:wpi="http://schemas.microsoft.com/office/word/2010/wordprocessingInk" xmlns:wne="http://schemas.microsoft.com/office/word/2006/wordml" xmlns:wps="http://schemas.microsoft.com/office/word/2010/wordprocessingShape" mc:Ignorable="w14 w15 wp14">
   <w:body>
     <w:p>
-      <w:proofErr w:type="spellStart"/>
-      <w:r>
+      <w:pPr>
+        <w:rPr>
+          <w:rFonts w:ascii="Times New Roman" w:hAnsi="Times New Roman" w:cs="Times New Roman"/>
+          <w:b/>
+          <w:sz w:val="24"/>
+          <w:szCs w:val="24"/>
+        </w:rPr>
+      </w:pPr>
+      <w:proofErr w:type="spellStart"/>
+      <w:r>
+        <w:rPr>
+          <w:rFonts w:ascii="Times New Roman" w:hAnsi="Times New Roman" w:cs="Times New Roman"/>
+          <w:b/>
+          <w:sz w:val="24"/>
+          <w:szCs w:val="24"/>
+        </w:rPr>
         <w:t>Fetch</w:t>
       </w:r>
       <w:proofErr w:type="spellEnd"/>
       <w:r>
+        <w:rPr>
+          <w:rFonts w:ascii="Times New Roman" w:hAnsi="Times New Roman" w:cs="Times New Roman"/>
+          <w:b/>
+          <w:sz w:val="24"/>
+          <w:szCs w:val="24"/>
+        </w:rPr>
         <w:t xml:space="preserve"> API</w:t>
       </w:r>
     </w:p>
     <w:p>
-      <w:r>
+      <w:pPr>
+        <w:rPr>
+          <w:rFonts w:ascii="Times New Roman" w:hAnsi="Times New Roman" w:cs="Times New Roman"/>
+          <w:sz w:val="24"/>
+          <w:szCs w:val="24"/>
+        </w:rPr>
+      </w:pPr>
+      <w:r>
+        <w:rPr>
+          <w:rFonts w:ascii="Times New Roman" w:hAnsi="Times New Roman" w:cs="Times New Roman"/>
+          <w:sz w:val="24"/>
+          <w:szCs w:val="24"/>
+        </w:rPr>
         <w:t xml:space="preserve">A </w:t>
       </w:r>
       <w:proofErr w:type="spellStart"/>
       <w:r>
+        <w:rPr>
+          <w:rFonts w:ascii="Times New Roman" w:hAnsi="Times New Roman" w:cs="Times New Roman"/>
+          <w:sz w:val="24"/>
+          <w:szCs w:val="24"/>
+        </w:rPr>
         <w:t>Fetch</w:t>
       </w:r>
       <w:proofErr w:type="spellEnd"/>
       <w:r>
+        <w:rPr>
+          <w:rFonts w:ascii="Times New Roman" w:hAnsi="Times New Roman" w:cs="Times New Roman"/>
+          <w:sz w:val="24"/>
+          <w:szCs w:val="24"/>
+        </w:rPr>
         <w:t xml:space="preserve"> </w:t>
       </w:r>
       <w:proofErr w:type="spellStart"/>
       <w:r>
+        <w:rPr>
+          <w:rFonts w:ascii="Times New Roman" w:hAnsi="Times New Roman" w:cs="Times New Roman"/>
+          <w:sz w:val="24"/>
+          <w:szCs w:val="24"/>
+        </w:rPr>
         <w:t>API-hoz</w:t>
       </w:r>
       <w:proofErr w:type="spellEnd"/>
       <w:r>
+        <w:rPr>
+          <w:rFonts w:ascii="Times New Roman" w:hAnsi="Times New Roman" w:cs="Times New Roman"/>
+          <w:sz w:val="24"/>
+          <w:szCs w:val="24"/>
+        </w:rPr>
         <w:t xml:space="preserve"> létre kellett ho</w:t>
       </w:r>
       <w:r>
+        <w:rPr>
+          <w:rFonts w:ascii="Times New Roman" w:hAnsi="Times New Roman" w:cs="Times New Roman"/>
+          <w:sz w:val="24"/>
+          <w:szCs w:val="24"/>
+        </w:rPr>
         <w:t>zni egy SQL adatbázist, melyet a</w:t>
       </w:r>
       <w:r>
+        <w:rPr>
+          <w:rFonts w:ascii="Times New Roman" w:hAnsi="Times New Roman" w:cs="Times New Roman"/>
+          <w:sz w:val="24"/>
+          <w:szCs w:val="24"/>
+        </w:rPr>
         <w:t xml:space="preserve"> fejlesztés során úgy oldottunk meg, hogy a </w:t>
       </w:r>
       <w:proofErr w:type="spellStart"/>
       <w:r>
+        <w:rPr>
+          <w:rFonts w:ascii="Times New Roman" w:hAnsi="Times New Roman" w:cs="Times New Roman"/>
+          <w:sz w:val="24"/>
+          <w:szCs w:val="24"/>
+        </w:rPr>
         <w:t>VSCode-ban</w:t>
       </w:r>
       <w:proofErr w:type="spellEnd"/>
       <w:r>
+        <w:rPr>
+          <w:rFonts w:ascii="Times New Roman" w:hAnsi="Times New Roman" w:cs="Times New Roman"/>
+          <w:sz w:val="24"/>
+          <w:szCs w:val="24"/>
+        </w:rPr>
         <w:t xml:space="preserve"> telepítettünk egy </w:t>
       </w:r>
       <w:proofErr w:type="spellStart"/>
       <w:r>
+        <w:rPr>
+          <w:rFonts w:ascii="Times New Roman" w:hAnsi="Times New Roman" w:cs="Times New Roman"/>
+          <w:sz w:val="24"/>
+          <w:szCs w:val="24"/>
+        </w:rPr>
         <w:t>SQLite</w:t>
       </w:r>
       <w:proofErr w:type="spellEnd"/>
       <w:r>
+        <w:rPr>
+          <w:rFonts w:ascii="Times New Roman" w:hAnsi="Times New Roman" w:cs="Times New Roman"/>
+          <w:sz w:val="24"/>
+          <w:szCs w:val="24"/>
+        </w:rPr>
         <w:t xml:space="preserve"> bővítményt, és hozzá az </w:t>
       </w:r>
       <w:proofErr w:type="spellStart"/>
       <w:r>
+        <w:rPr>
+          <w:rFonts w:ascii="Times New Roman" w:hAnsi="Times New Roman" w:cs="Times New Roman"/>
+          <w:sz w:val="24"/>
+          <w:szCs w:val="24"/>
+        </w:rPr>
         <w:t>SQLite</w:t>
       </w:r>
       <w:proofErr w:type="spellEnd"/>
       <w:r>
+        <w:rPr>
+          <w:rFonts w:ascii="Times New Roman" w:hAnsi="Times New Roman" w:cs="Times New Roman"/>
+          <w:sz w:val="24"/>
+          <w:szCs w:val="24"/>
+        </w:rPr>
         <w:t xml:space="preserve"> </w:t>
       </w:r>
       <w:proofErr w:type="spellStart"/>
       <w:r>
+        <w:rPr>
+          <w:rFonts w:ascii="Times New Roman" w:hAnsi="Times New Roman" w:cs="Times New Roman"/>
+          <w:sz w:val="24"/>
+          <w:szCs w:val="24"/>
+        </w:rPr>
         <w:t>Viewer</w:t>
       </w:r>
       <w:proofErr w:type="spellEnd"/>
       <w:r>
+        <w:rPr>
+          <w:rFonts w:ascii="Times New Roman" w:hAnsi="Times New Roman" w:cs="Times New Roman"/>
+          <w:sz w:val="24"/>
+          <w:szCs w:val="24"/>
+        </w:rPr>
         <w:t xml:space="preserve"> bővítményt. </w:t>
       </w:r>
+      <w:bookmarkStart w:id="0" w:name="_GoBack"/>
+      <w:bookmarkEnd w:id="0"/>
     </w:p>
     <w:p>
-      <w:r>
+      <w:pPr>
+        <w:rPr>
+          <w:rFonts w:ascii="Times New Roman" w:hAnsi="Times New Roman" w:cs="Times New Roman"/>
+          <w:sz w:val="24"/>
+          <w:szCs w:val="24"/>
+        </w:rPr>
+      </w:pPr>
+      <w:r>
+        <w:rPr>
+          <w:rFonts w:ascii="Times New Roman" w:hAnsi="Times New Roman" w:cs="Times New Roman"/>
+          <w:noProof/>
+          <w:sz w:val="24"/>
+          <w:szCs w:val="24"/>
+          <w:lang w:eastAsia="hu-HU"/>
+        </w:rPr>
         <w:drawing>
           <wp:inline distT="0" distB="0" distL="0" distR="0" wp14:anchorId="726912C4" wp14:editId="7A2077B0">
             <wp:extent cx="5181600" cy="2565098"/>
@@ -111,156 +229,1554 @@
       </w:r>
     </w:p>
     <w:p>
-      <w:r>
+      <w:pPr>
+        <w:rPr>
+          <w:rFonts w:ascii="Times New Roman" w:hAnsi="Times New Roman" w:cs="Times New Roman"/>
+          <w:sz w:val="24"/>
+          <w:szCs w:val="24"/>
+        </w:rPr>
+      </w:pPr>
+      <w:r>
+        <w:rPr>
+          <w:rFonts w:ascii="Times New Roman" w:hAnsi="Times New Roman" w:cs="Times New Roman"/>
+          <w:sz w:val="24"/>
+          <w:szCs w:val="24"/>
+        </w:rPr>
         <w:t xml:space="preserve">A bővítmény sajnos igen hiányos, egy sima export funkciót nem találtunk benne, így egy online konverterrel átalakítottuk a </w:t>
       </w:r>
       <w:proofErr w:type="spellStart"/>
       <w:r>
+        <w:rPr>
+          <w:rFonts w:ascii="Times New Roman" w:hAnsi="Times New Roman" w:cs="Times New Roman"/>
+          <w:sz w:val="24"/>
+          <w:szCs w:val="24"/>
+        </w:rPr>
         <w:t>txt-ben</w:t>
       </w:r>
       <w:proofErr w:type="spellEnd"/>
       <w:r>
+        <w:rPr>
+          <w:rFonts w:ascii="Times New Roman" w:hAnsi="Times New Roman" w:cs="Times New Roman"/>
+          <w:sz w:val="24"/>
+          <w:szCs w:val="24"/>
+        </w:rPr>
         <w:t xml:space="preserve"> kapott </w:t>
       </w:r>
       <w:proofErr w:type="gramStart"/>
       <w:r>
+        <w:rPr>
+          <w:rFonts w:ascii="Times New Roman" w:hAnsi="Times New Roman" w:cs="Times New Roman"/>
+          <w:sz w:val="24"/>
+          <w:szCs w:val="24"/>
+        </w:rPr>
         <w:t>adatbázisokat .</w:t>
       </w:r>
       <w:proofErr w:type="spellStart"/>
       <w:r>
+        <w:rPr>
+          <w:rFonts w:ascii="Times New Roman" w:hAnsi="Times New Roman" w:cs="Times New Roman"/>
+          <w:sz w:val="24"/>
+          <w:szCs w:val="24"/>
+        </w:rPr>
         <w:t>sql</w:t>
       </w:r>
       <w:proofErr w:type="spellEnd"/>
       <w:proofErr w:type="gramEnd"/>
       <w:r>
+        <w:rPr>
+          <w:rFonts w:ascii="Times New Roman" w:hAnsi="Times New Roman" w:cs="Times New Roman"/>
+          <w:sz w:val="24"/>
+          <w:szCs w:val="24"/>
+        </w:rPr>
         <w:t xml:space="preserve"> kiterjesztésű, beimportálható fájlokká. URL: </w:t>
       </w:r>
       <w:hyperlink r:id="rId5" w:history="1">
         <w:r>
           <w:rPr>
             <w:rStyle w:val="Hiperhivatkozs"/>
+            <w:rFonts w:ascii="Times New Roman" w:hAnsi="Times New Roman" w:cs="Times New Roman"/>
+            <w:sz w:val="24"/>
+            <w:szCs w:val="24"/>
           </w:rPr>
           <w:t>https://products.aspose.app/cells/conversion/txt-to-sql</w:t>
         </w:r>
       </w:hyperlink>
     </w:p>
     <w:p>
-      <w:r>
+      <w:pPr>
+        <w:rPr>
+          <w:rFonts w:ascii="Times New Roman" w:hAnsi="Times New Roman" w:cs="Times New Roman"/>
+          <w:sz w:val="24"/>
+          <w:szCs w:val="24"/>
+        </w:rPr>
+      </w:pPr>
+      <w:r>
+        <w:rPr>
+          <w:rFonts w:ascii="Times New Roman" w:hAnsi="Times New Roman" w:cs="Times New Roman"/>
+          <w:sz w:val="24"/>
+          <w:szCs w:val="24"/>
+        </w:rPr>
         <w:t xml:space="preserve">Azonban itt néhány típust nem sikerült </w:t>
       </w:r>
       <w:r>
+        <w:rPr>
+          <w:rFonts w:ascii="Times New Roman" w:hAnsi="Times New Roman" w:cs="Times New Roman"/>
+          <w:sz w:val="24"/>
+          <w:szCs w:val="24"/>
+        </w:rPr>
         <w:t>eltalálnia</w:t>
       </w:r>
       <w:r>
+        <w:rPr>
+          <w:rFonts w:ascii="Times New Roman" w:hAnsi="Times New Roman" w:cs="Times New Roman"/>
+          <w:sz w:val="24"/>
+          <w:szCs w:val="24"/>
+        </w:rPr>
         <w:t xml:space="preserve"> a konverternek, például az </w:t>
       </w:r>
       <w:proofErr w:type="spellStart"/>
       <w:r>
+        <w:rPr>
+          <w:rFonts w:ascii="Times New Roman" w:hAnsi="Times New Roman" w:cs="Times New Roman"/>
+          <w:sz w:val="24"/>
+          <w:szCs w:val="24"/>
+        </w:rPr>
         <w:t>Id</w:t>
       </w:r>
       <w:proofErr w:type="spellEnd"/>
       <w:r>
+        <w:rPr>
+          <w:rFonts w:ascii="Times New Roman" w:hAnsi="Times New Roman" w:cs="Times New Roman"/>
+          <w:sz w:val="24"/>
+          <w:szCs w:val="24"/>
+        </w:rPr>
         <w:t xml:space="preserve"> mezőt </w:t>
       </w:r>
       <w:proofErr w:type="spellStart"/>
       <w:r>
+        <w:rPr>
+          <w:rFonts w:ascii="Times New Roman" w:hAnsi="Times New Roman" w:cs="Times New Roman"/>
+          <w:sz w:val="24"/>
+          <w:szCs w:val="24"/>
+        </w:rPr>
         <w:t>Double</w:t>
       </w:r>
       <w:proofErr w:type="spellEnd"/>
       <w:r>
+        <w:rPr>
+          <w:rFonts w:ascii="Times New Roman" w:hAnsi="Times New Roman" w:cs="Times New Roman"/>
+          <w:sz w:val="24"/>
+          <w:szCs w:val="24"/>
+        </w:rPr>
         <w:t xml:space="preserve"> típusúra szerette volna csinálni, ezt átírtuk Integer típusra, és automatikus számozást állítottunk be neki, hogy a felhasználónak ne kelljen bajlódni az </w:t>
       </w:r>
       <w:proofErr w:type="spellStart"/>
       <w:r>
+        <w:rPr>
+          <w:rFonts w:ascii="Times New Roman" w:hAnsi="Times New Roman" w:cs="Times New Roman"/>
+          <w:sz w:val="24"/>
+          <w:szCs w:val="24"/>
+        </w:rPr>
         <w:t>Id</w:t>
       </w:r>
       <w:proofErr w:type="spellEnd"/>
       <w:r>
+        <w:rPr>
+          <w:rFonts w:ascii="Times New Roman" w:hAnsi="Times New Roman" w:cs="Times New Roman"/>
+          <w:sz w:val="24"/>
+          <w:szCs w:val="24"/>
+        </w:rPr>
         <w:t xml:space="preserve"> számozásával, és biztosan ne legyen ütközés a szerkesztések során.</w:t>
       </w:r>
       <w:r>
+        <w:rPr>
+          <w:rFonts w:ascii="Times New Roman" w:hAnsi="Times New Roman" w:cs="Times New Roman"/>
+          <w:sz w:val="24"/>
+          <w:szCs w:val="24"/>
+        </w:rPr>
         <w:t xml:space="preserve"> Az adatbázist manuálisan hoztam létre a </w:t>
       </w:r>
       <w:proofErr w:type="spellStart"/>
       <w:r>
+        <w:rPr>
+          <w:rFonts w:ascii="Times New Roman" w:hAnsi="Times New Roman" w:cs="Times New Roman"/>
+          <w:sz w:val="24"/>
+          <w:szCs w:val="24"/>
+        </w:rPr>
         <w:t>VCSodeban</w:t>
       </w:r>
       <w:proofErr w:type="spellEnd"/>
       <w:r>
+        <w:rPr>
+          <w:rFonts w:ascii="Times New Roman" w:hAnsi="Times New Roman" w:cs="Times New Roman"/>
+          <w:sz w:val="24"/>
+          <w:szCs w:val="24"/>
+        </w:rPr>
         <w:t>. A PHP kód alapja az órán tanultak. Az adatbázishoz való csatlakozáshoz (</w:t>
       </w:r>
       <w:proofErr w:type="spellStart"/>
       <w:r>
+        <w:rPr>
+          <w:rFonts w:ascii="Times New Roman" w:hAnsi="Times New Roman" w:cs="Times New Roman"/>
+          <w:sz w:val="24"/>
+          <w:szCs w:val="24"/>
+        </w:rPr>
         <w:t>db.php</w:t>
       </w:r>
       <w:proofErr w:type="spellEnd"/>
       <w:r>
+        <w:rPr>
+          <w:rFonts w:ascii="Times New Roman" w:hAnsi="Times New Roman" w:cs="Times New Roman"/>
+          <w:sz w:val="24"/>
+          <w:szCs w:val="24"/>
+        </w:rPr>
         <w:t xml:space="preserve">) természetesen nem volt megfelelő az órai kód, mivel tejesen más az XAMPP adatbázishoz csatlakozni, mint az </w:t>
       </w:r>
       <w:proofErr w:type="spellStart"/>
       <w:r>
+        <w:rPr>
+          <w:rFonts w:ascii="Times New Roman" w:hAnsi="Times New Roman" w:cs="Times New Roman"/>
+          <w:sz w:val="24"/>
+          <w:szCs w:val="24"/>
+        </w:rPr>
         <w:t>SQLite-hoz</w:t>
       </w:r>
       <w:proofErr w:type="spellEnd"/>
       <w:r>
+        <w:rPr>
+          <w:rFonts w:ascii="Times New Roman" w:hAnsi="Times New Roman" w:cs="Times New Roman"/>
+          <w:sz w:val="24"/>
+          <w:szCs w:val="24"/>
+        </w:rPr>
         <w:t xml:space="preserve">, így azt, majd ha feltöltjük a tárhelyre, akkor módosítani kell. Először több kiolvasási probléma volt, </w:t>
       </w:r>
       <w:r>
+        <w:rPr>
+          <w:rFonts w:ascii="Times New Roman" w:hAnsi="Times New Roman" w:cs="Times New Roman"/>
+          <w:sz w:val="24"/>
+          <w:szCs w:val="24"/>
+        </w:rPr>
         <w:t>ezért egy rövidebb kóddal próbálkoztunk. Végül, amikor sikerült az adatbázishoz csatlakozni, akkor tértünk át az órán tanult php kódra (</w:t>
       </w:r>
       <w:proofErr w:type="spellStart"/>
       <w:r>
+        <w:rPr>
+          <w:rFonts w:ascii="Times New Roman" w:hAnsi="Times New Roman" w:cs="Times New Roman"/>
+          <w:sz w:val="24"/>
+          <w:szCs w:val="24"/>
+        </w:rPr>
         <w:t>read.php</w:t>
       </w:r>
       <w:proofErr w:type="spellEnd"/>
       <w:r>
+        <w:rPr>
+          <w:rFonts w:ascii="Times New Roman" w:hAnsi="Times New Roman" w:cs="Times New Roman"/>
+          <w:sz w:val="24"/>
+          <w:szCs w:val="24"/>
+        </w:rPr>
         <w:t xml:space="preserve">), és átalakítottuk a saját adatbázisunknak megfelelően. </w:t>
       </w:r>
       <w:r>
+        <w:rPr>
+          <w:rFonts w:ascii="Times New Roman" w:hAnsi="Times New Roman" w:cs="Times New Roman"/>
+          <w:sz w:val="24"/>
+          <w:szCs w:val="24"/>
+        </w:rPr>
         <w:t>Hasonlóan építettük fel a kliensoldali kódot is (</w:t>
       </w:r>
       <w:proofErr w:type="spellStart"/>
       <w:r>
+        <w:rPr>
+          <w:rFonts w:ascii="Times New Roman" w:hAnsi="Times New Roman" w:cs="Times New Roman"/>
+          <w:sz w:val="24"/>
+          <w:szCs w:val="24"/>
+        </w:rPr>
         <w:t>fetchapi</w:t>
       </w:r>
       <w:proofErr w:type="spellEnd"/>
       <w:r>
+        <w:rPr>
+          <w:rFonts w:ascii="Times New Roman" w:hAnsi="Times New Roman" w:cs="Times New Roman"/>
+          <w:sz w:val="24"/>
+          <w:szCs w:val="24"/>
+        </w:rPr>
         <w:t>_</w:t>
       </w:r>
       <w:proofErr w:type="spellStart"/>
       <w:r>
+        <w:rPr>
+          <w:rFonts w:ascii="Times New Roman" w:hAnsi="Times New Roman" w:cs="Times New Roman"/>
+          <w:sz w:val="24"/>
+          <w:szCs w:val="24"/>
+        </w:rPr>
         <w:t>js.js</w:t>
       </w:r>
       <w:proofErr w:type="spellEnd"/>
       <w:r>
+        <w:rPr>
+          <w:rFonts w:ascii="Times New Roman" w:hAnsi="Times New Roman" w:cs="Times New Roman"/>
+          <w:sz w:val="24"/>
+          <w:szCs w:val="24"/>
+        </w:rPr>
         <w:t xml:space="preserve">) és a </w:t>
       </w:r>
       <w:proofErr w:type="spellStart"/>
       <w:r>
+        <w:rPr>
+          <w:rFonts w:ascii="Times New Roman" w:hAnsi="Times New Roman" w:cs="Times New Roman"/>
+          <w:sz w:val="24"/>
+          <w:szCs w:val="24"/>
+        </w:rPr>
         <w:t>html</w:t>
       </w:r>
       <w:proofErr w:type="spellEnd"/>
       <w:r>
+        <w:rPr>
+          <w:rFonts w:ascii="Times New Roman" w:hAnsi="Times New Roman" w:cs="Times New Roman"/>
+          <w:sz w:val="24"/>
+          <w:szCs w:val="24"/>
+        </w:rPr>
         <w:t xml:space="preserve"> oldalt is. A </w:t>
       </w:r>
       <w:proofErr w:type="spellStart"/>
       <w:r>
+        <w:rPr>
+          <w:rFonts w:ascii="Times New Roman" w:hAnsi="Times New Roman" w:cs="Times New Roman"/>
+          <w:sz w:val="24"/>
+          <w:szCs w:val="24"/>
+        </w:rPr>
         <w:t>html</w:t>
       </w:r>
       <w:proofErr w:type="spellEnd"/>
       <w:r>
+        <w:rPr>
+          <w:rFonts w:ascii="Times New Roman" w:hAnsi="Times New Roman" w:cs="Times New Roman"/>
+          <w:sz w:val="24"/>
+          <w:szCs w:val="24"/>
+        </w:rPr>
         <w:t xml:space="preserve"> formázásánál az előre megírt </w:t>
       </w:r>
       <w:proofErr w:type="spellStart"/>
       <w:r>
+        <w:rPr>
+          <w:rFonts w:ascii="Times New Roman" w:hAnsi="Times New Roman" w:cs="Times New Roman"/>
+          <w:sz w:val="24"/>
+          <w:szCs w:val="24"/>
+        </w:rPr>
         <w:t>css</w:t>
       </w:r>
       <w:proofErr w:type="spellEnd"/>
       <w:r>
+        <w:rPr>
+          <w:rFonts w:ascii="Times New Roman" w:hAnsi="Times New Roman" w:cs="Times New Roman"/>
+          <w:sz w:val="24"/>
+          <w:szCs w:val="24"/>
+        </w:rPr>
         <w:t xml:space="preserve"> fájlokat használtuk. </w:t>
       </w:r>
-      <w:bookmarkStart w:id="0" w:name="_GoBack"/>
-      <w:bookmarkEnd w:id="0"/>
+      <w:r>
+        <w:rPr>
+          <w:rFonts w:ascii="Times New Roman" w:hAnsi="Times New Roman" w:cs="Times New Roman"/>
+          <w:sz w:val="24"/>
+          <w:szCs w:val="24"/>
+        </w:rPr>
+        <w:t xml:space="preserve">Ez a weboldalrész a </w:t>
+      </w:r>
+      <w:proofErr w:type="spellStart"/>
+      <w:r>
+        <w:rPr>
+          <w:rFonts w:ascii="Times New Roman" w:hAnsi="Times New Roman" w:cs="Times New Roman"/>
+          <w:sz w:val="24"/>
+          <w:szCs w:val="24"/>
+        </w:rPr>
+        <w:t>localhost</w:t>
+      </w:r>
+      <w:proofErr w:type="spellEnd"/>
+      <w:r>
+        <w:rPr>
+          <w:rFonts w:ascii="Times New Roman" w:hAnsi="Times New Roman" w:cs="Times New Roman"/>
+          <w:sz w:val="24"/>
+          <w:szCs w:val="24"/>
+        </w:rPr>
+        <w:t xml:space="preserve">:8000-es </w:t>
+      </w:r>
+      <w:proofErr w:type="spellStart"/>
+      <w:r>
+        <w:rPr>
+          <w:rFonts w:ascii="Times New Roman" w:hAnsi="Times New Roman" w:cs="Times New Roman"/>
+          <w:sz w:val="24"/>
+          <w:szCs w:val="24"/>
+        </w:rPr>
+        <w:t>porton</w:t>
+      </w:r>
+      <w:proofErr w:type="spellEnd"/>
+      <w:r>
+        <w:rPr>
+          <w:rFonts w:ascii="Times New Roman" w:hAnsi="Times New Roman" w:cs="Times New Roman"/>
+          <w:sz w:val="24"/>
+          <w:szCs w:val="24"/>
+        </w:rPr>
+        <w:t xml:space="preserve"> futott. </w:t>
+      </w:r>
+    </w:p>
+    <w:p>
+      <w:pPr>
+        <w:rPr>
+          <w:rFonts w:ascii="Times New Roman" w:hAnsi="Times New Roman" w:cs="Times New Roman"/>
+          <w:b/>
+          <w:bCs/>
+          <w:sz w:val="24"/>
+          <w:szCs w:val="24"/>
+        </w:rPr>
+      </w:pPr>
+      <w:proofErr w:type="spellStart"/>
+      <w:r>
+        <w:rPr>
+          <w:rFonts w:ascii="Times New Roman" w:hAnsi="Times New Roman" w:cs="Times New Roman"/>
+          <w:b/>
+          <w:bCs/>
+          <w:sz w:val="24"/>
+          <w:szCs w:val="24"/>
+        </w:rPr>
+        <w:t>Axios</w:t>
+      </w:r>
+      <w:proofErr w:type="spellEnd"/>
+      <w:r>
+        <w:rPr>
+          <w:rFonts w:ascii="Times New Roman" w:hAnsi="Times New Roman" w:cs="Times New Roman"/>
+          <w:b/>
+          <w:bCs/>
+          <w:sz w:val="24"/>
+          <w:szCs w:val="24"/>
+        </w:rPr>
+        <w:t xml:space="preserve"> menü</w:t>
+      </w:r>
+    </w:p>
+    <w:p>
+      <w:pPr>
+        <w:rPr>
+          <w:rFonts w:ascii="Times New Roman" w:hAnsi="Times New Roman" w:cs="Times New Roman"/>
+          <w:sz w:val="24"/>
+          <w:szCs w:val="24"/>
+        </w:rPr>
+      </w:pPr>
+      <w:r>
+        <w:rPr>
+          <w:rFonts w:ascii="Times New Roman" w:hAnsi="Times New Roman" w:cs="Times New Roman"/>
+          <w:sz w:val="24"/>
+          <w:szCs w:val="24"/>
+        </w:rPr>
+        <w:t>Ennél a menüpontnál az adatbázis része már lényegében készen volt. Az applikáció megírásához a tanórai kódból indultunk ki. A táblázat és a beviteli mező egységesítése jelentett egy kis kihívást, de sikeresen leküzdöttük.</w:t>
+      </w:r>
+      <w:r>
+        <w:rPr>
+          <w:rFonts w:ascii="Times New Roman" w:hAnsi="Times New Roman" w:cs="Times New Roman"/>
+          <w:sz w:val="24"/>
+          <w:szCs w:val="24"/>
+        </w:rPr>
+        <w:t xml:space="preserve"> Az adatbázist mivel egy mási</w:t>
+      </w:r>
+      <w:r>
+        <w:rPr>
+          <w:rFonts w:ascii="Times New Roman" w:hAnsi="Times New Roman" w:cs="Times New Roman"/>
+          <w:sz w:val="24"/>
+          <w:szCs w:val="24"/>
+        </w:rPr>
+        <w:t xml:space="preserve">k </w:t>
+      </w:r>
+      <w:proofErr w:type="spellStart"/>
+      <w:r>
+        <w:rPr>
+          <w:rFonts w:ascii="Times New Roman" w:hAnsi="Times New Roman" w:cs="Times New Roman"/>
+          <w:sz w:val="24"/>
+          <w:szCs w:val="24"/>
+        </w:rPr>
+        <w:t>po</w:t>
+      </w:r>
+      <w:r>
+        <w:rPr>
+          <w:rFonts w:ascii="Times New Roman" w:hAnsi="Times New Roman" w:cs="Times New Roman"/>
+          <w:sz w:val="24"/>
+          <w:szCs w:val="24"/>
+        </w:rPr>
+        <w:t>r</w:t>
+      </w:r>
+      <w:r>
+        <w:rPr>
+          <w:rFonts w:ascii="Times New Roman" w:hAnsi="Times New Roman" w:cs="Times New Roman"/>
+          <w:sz w:val="24"/>
+          <w:szCs w:val="24"/>
+        </w:rPr>
+        <w:t>t</w:t>
+      </w:r>
+      <w:r>
+        <w:rPr>
+          <w:rFonts w:ascii="Times New Roman" w:hAnsi="Times New Roman" w:cs="Times New Roman"/>
+          <w:sz w:val="24"/>
+          <w:szCs w:val="24"/>
+        </w:rPr>
+        <w:t>on</w:t>
+      </w:r>
+      <w:proofErr w:type="spellEnd"/>
+      <w:r>
+        <w:rPr>
+          <w:rFonts w:ascii="Times New Roman" w:hAnsi="Times New Roman" w:cs="Times New Roman"/>
+          <w:sz w:val="24"/>
+          <w:szCs w:val="24"/>
+        </w:rPr>
+        <w:t xml:space="preserve"> futott (az </w:t>
+      </w:r>
+      <w:r>
+        <w:rPr>
+          <w:rFonts w:ascii="Times New Roman" w:hAnsi="Times New Roman" w:cs="Times New Roman"/>
+          <w:sz w:val="24"/>
+          <w:szCs w:val="24"/>
+        </w:rPr>
+        <w:t xml:space="preserve">én gépemen a </w:t>
+      </w:r>
+      <w:proofErr w:type="spellStart"/>
+      <w:r>
+        <w:rPr>
+          <w:rFonts w:ascii="Times New Roman" w:hAnsi="Times New Roman" w:cs="Times New Roman"/>
+          <w:sz w:val="24"/>
+          <w:szCs w:val="24"/>
+        </w:rPr>
+        <w:t>localhost</w:t>
+      </w:r>
+      <w:proofErr w:type="spellEnd"/>
+      <w:r>
+        <w:rPr>
+          <w:rFonts w:ascii="Times New Roman" w:hAnsi="Times New Roman" w:cs="Times New Roman"/>
+          <w:sz w:val="24"/>
+          <w:szCs w:val="24"/>
+        </w:rPr>
+        <w:t xml:space="preserve">:8000, a </w:t>
+      </w:r>
+      <w:proofErr w:type="spellStart"/>
+      <w:r>
+        <w:rPr>
+          <w:rFonts w:ascii="Times New Roman" w:hAnsi="Times New Roman" w:cs="Times New Roman"/>
+          <w:sz w:val="24"/>
+          <w:szCs w:val="24"/>
+        </w:rPr>
+        <w:t>R</w:t>
+      </w:r>
+      <w:r>
+        <w:rPr>
+          <w:rFonts w:ascii="Times New Roman" w:hAnsi="Times New Roman" w:cs="Times New Roman"/>
+          <w:sz w:val="24"/>
+          <w:szCs w:val="24"/>
+        </w:rPr>
+        <w:t>eact-ot</w:t>
+      </w:r>
+      <w:proofErr w:type="spellEnd"/>
+      <w:r>
+        <w:rPr>
+          <w:rFonts w:ascii="Times New Roman" w:hAnsi="Times New Roman" w:cs="Times New Roman"/>
+          <w:sz w:val="24"/>
+          <w:szCs w:val="24"/>
+        </w:rPr>
+        <w:t xml:space="preserve"> futtató </w:t>
+      </w:r>
+      <w:proofErr w:type="spellStart"/>
+      <w:r>
+        <w:rPr>
+          <w:rFonts w:ascii="Times New Roman" w:hAnsi="Times New Roman" w:cs="Times New Roman"/>
+          <w:sz w:val="24"/>
+          <w:szCs w:val="24"/>
+        </w:rPr>
+        <w:t>npm</w:t>
+      </w:r>
+      <w:proofErr w:type="spellEnd"/>
+      <w:r>
+        <w:rPr>
+          <w:rFonts w:ascii="Times New Roman" w:hAnsi="Times New Roman" w:cs="Times New Roman"/>
+          <w:sz w:val="24"/>
+          <w:szCs w:val="24"/>
+        </w:rPr>
+        <w:t xml:space="preserve"> pedig a </w:t>
+      </w:r>
+      <w:proofErr w:type="spellStart"/>
+      <w:r>
+        <w:rPr>
+          <w:rFonts w:ascii="Times New Roman" w:hAnsi="Times New Roman" w:cs="Times New Roman"/>
+          <w:sz w:val="24"/>
+          <w:szCs w:val="24"/>
+        </w:rPr>
+        <w:t>localhost</w:t>
+      </w:r>
+      <w:proofErr w:type="spellEnd"/>
+      <w:r>
+        <w:rPr>
+          <w:rFonts w:ascii="Times New Roman" w:hAnsi="Times New Roman" w:cs="Times New Roman"/>
+          <w:sz w:val="24"/>
+          <w:szCs w:val="24"/>
+        </w:rPr>
+        <w:t>:5173</w:t>
+      </w:r>
+      <w:r>
+        <w:rPr>
+          <w:rFonts w:ascii="Times New Roman" w:hAnsi="Times New Roman" w:cs="Times New Roman"/>
+          <w:sz w:val="24"/>
+          <w:szCs w:val="24"/>
+        </w:rPr>
+        <w:t xml:space="preserve"> </w:t>
+      </w:r>
+      <w:proofErr w:type="spellStart"/>
+      <w:r>
+        <w:rPr>
+          <w:rFonts w:ascii="Times New Roman" w:hAnsi="Times New Roman" w:cs="Times New Roman"/>
+          <w:sz w:val="24"/>
+          <w:szCs w:val="24"/>
+        </w:rPr>
+        <w:t>porton</w:t>
+      </w:r>
+      <w:proofErr w:type="spellEnd"/>
+      <w:r>
+        <w:rPr>
+          <w:rFonts w:ascii="Times New Roman" w:hAnsi="Times New Roman" w:cs="Times New Roman"/>
+          <w:sz w:val="24"/>
+          <w:szCs w:val="24"/>
+        </w:rPr>
+        <w:t>)</w:t>
+      </w:r>
+      <w:r>
+        <w:rPr>
+          <w:rFonts w:ascii="Times New Roman" w:hAnsi="Times New Roman" w:cs="Times New Roman"/>
+          <w:sz w:val="24"/>
+          <w:szCs w:val="24"/>
+        </w:rPr>
+        <w:t xml:space="preserve"> ezért néhány módosítást kellett </w:t>
+      </w:r>
+      <w:r>
+        <w:rPr>
+          <w:rFonts w:ascii="Times New Roman" w:hAnsi="Times New Roman" w:cs="Times New Roman"/>
+          <w:sz w:val="24"/>
+          <w:szCs w:val="24"/>
+        </w:rPr>
+        <w:t>elvégezni</w:t>
+      </w:r>
+      <w:r>
+        <w:rPr>
+          <w:rFonts w:ascii="Times New Roman" w:hAnsi="Times New Roman" w:cs="Times New Roman"/>
+          <w:sz w:val="24"/>
+          <w:szCs w:val="24"/>
+        </w:rPr>
+        <w:t xml:space="preserve"> a kódban, hogy a</w:t>
+      </w:r>
+      <w:r>
+        <w:rPr>
+          <w:rFonts w:ascii="Times New Roman" w:hAnsi="Times New Roman" w:cs="Times New Roman"/>
+          <w:sz w:val="24"/>
+          <w:szCs w:val="24"/>
+        </w:rPr>
+        <w:t xml:space="preserve"> teszt működjön. M</w:t>
+      </w:r>
+      <w:r>
+        <w:rPr>
+          <w:rFonts w:ascii="Times New Roman" w:hAnsi="Times New Roman" w:cs="Times New Roman"/>
+          <w:sz w:val="24"/>
+          <w:szCs w:val="24"/>
+        </w:rPr>
+        <w:t xml:space="preserve">ivel eleinte beleestünk abba a hibába, hogy erre nem figyeltünk, és nem </w:t>
+      </w:r>
+      <w:r>
+        <w:rPr>
+          <w:rFonts w:ascii="Times New Roman" w:hAnsi="Times New Roman" w:cs="Times New Roman"/>
+          <w:sz w:val="24"/>
+          <w:szCs w:val="24"/>
+        </w:rPr>
+        <w:t>érettük</w:t>
+      </w:r>
+      <w:r>
+        <w:rPr>
+          <w:rFonts w:ascii="Times New Roman" w:hAnsi="Times New Roman" w:cs="Times New Roman"/>
+          <w:sz w:val="24"/>
+          <w:szCs w:val="24"/>
+        </w:rPr>
+        <w:t xml:space="preserve"> hirtelen miért van az, hogy vagy az adatbá</w:t>
+      </w:r>
+      <w:r>
+        <w:rPr>
+          <w:rFonts w:ascii="Times New Roman" w:hAnsi="Times New Roman" w:cs="Times New Roman"/>
+          <w:sz w:val="24"/>
+          <w:szCs w:val="24"/>
+        </w:rPr>
+        <w:t xml:space="preserve">zist nem látjuk, vagy a </w:t>
+      </w:r>
+      <w:proofErr w:type="spellStart"/>
+      <w:r>
+        <w:rPr>
+          <w:rFonts w:ascii="Times New Roman" w:hAnsi="Times New Roman" w:cs="Times New Roman"/>
+          <w:sz w:val="24"/>
+          <w:szCs w:val="24"/>
+        </w:rPr>
+        <w:t>React</w:t>
+      </w:r>
+      <w:proofErr w:type="spellEnd"/>
+      <w:r>
+        <w:rPr>
+          <w:rFonts w:ascii="Times New Roman" w:hAnsi="Times New Roman" w:cs="Times New Roman"/>
+          <w:sz w:val="24"/>
+          <w:szCs w:val="24"/>
+        </w:rPr>
+        <w:t xml:space="preserve"> nem akart működni, ahogyan a mellékelt ábra mutatja:</w:t>
+      </w:r>
+    </w:p>
+    <w:p>
+      <w:pPr>
+        <w:rPr>
+          <w:rFonts w:ascii="Times New Roman" w:hAnsi="Times New Roman" w:cs="Times New Roman"/>
+          <w:sz w:val="24"/>
+          <w:szCs w:val="24"/>
+        </w:rPr>
+      </w:pPr>
+    </w:p>
+    <w:p>
+      <w:pPr>
+        <w:rPr>
+          <w:rFonts w:ascii="Times New Roman" w:hAnsi="Times New Roman" w:cs="Times New Roman"/>
+          <w:sz w:val="24"/>
+          <w:szCs w:val="24"/>
+        </w:rPr>
+      </w:pPr>
+      <w:r>
+        <w:rPr>
+          <w:rFonts w:ascii="Times New Roman" w:hAnsi="Times New Roman" w:cs="Times New Roman"/>
+          <w:sz w:val="24"/>
+          <w:szCs w:val="24"/>
+        </w:rPr>
+        <w:lastRenderedPageBreak/>
+        <w:drawing>
+          <wp:inline distT="0" distB="0" distL="0" distR="0" wp14:anchorId="2633D281" wp14:editId="616E07C0">
+            <wp:extent cx="5760720" cy="3314700"/>
+            <wp:effectExtent l="0" t="0" r="0" b="0"/>
+            <wp:docPr id="2" name="Kép 2"/>
+            <wp:cNvGraphicFramePr>
+              <a:graphicFrameLocks xmlns:a="http://schemas.openxmlformats.org/drawingml/2006/main" noChangeAspect="1"/>
+            </wp:cNvGraphicFramePr>
+            <a:graphic xmlns:a="http://schemas.openxmlformats.org/drawingml/2006/main">
+              <a:graphicData uri="http://schemas.openxmlformats.org/drawingml/2006/picture">
+                <pic:pic xmlns:pic="http://schemas.openxmlformats.org/drawingml/2006/picture">
+                  <pic:nvPicPr>
+                    <pic:cNvPr id="1" name=""/>
+                    <pic:cNvPicPr/>
+                  </pic:nvPicPr>
+                  <pic:blipFill>
+                    <a:blip r:embed="rId6"/>
+                    <a:stretch>
+                      <a:fillRect/>
+                    </a:stretch>
+                  </pic:blipFill>
+                  <pic:spPr>
+                    <a:xfrm>
+                      <a:off x="0" y="0"/>
+                      <a:ext cx="5760720" cy="3314700"/>
+                    </a:xfrm>
+                    <a:prstGeom prst="rect">
+                      <a:avLst/>
+                    </a:prstGeom>
+                  </pic:spPr>
+                </pic:pic>
+              </a:graphicData>
+            </a:graphic>
+          </wp:inline>
+        </w:drawing>
+      </w:r>
+    </w:p>
+    <w:p>
+      <w:pPr>
+        <w:rPr>
+          <w:rFonts w:ascii="Times New Roman" w:hAnsi="Times New Roman" w:cs="Times New Roman"/>
+          <w:sz w:val="24"/>
+          <w:szCs w:val="24"/>
+        </w:rPr>
+      </w:pPr>
+      <w:r>
+        <w:rPr>
+          <w:rFonts w:ascii="Times New Roman" w:hAnsi="Times New Roman" w:cs="Times New Roman"/>
+          <w:sz w:val="24"/>
+          <w:szCs w:val="24"/>
+        </w:rPr>
+        <w:t xml:space="preserve"> Ezt úgy oldottuk meg, hogy a </w:t>
+      </w:r>
+      <w:proofErr w:type="spellStart"/>
+      <w:r>
+        <w:rPr>
+          <w:rFonts w:ascii="Times New Roman" w:hAnsi="Times New Roman" w:cs="Times New Roman"/>
+          <w:sz w:val="24"/>
+          <w:szCs w:val="24"/>
+        </w:rPr>
+        <w:t>read.php</w:t>
+      </w:r>
+      <w:proofErr w:type="spellEnd"/>
+      <w:r>
+        <w:rPr>
+          <w:rFonts w:ascii="Times New Roman" w:hAnsi="Times New Roman" w:cs="Times New Roman"/>
+          <w:sz w:val="24"/>
+          <w:szCs w:val="24"/>
+        </w:rPr>
+        <w:t xml:space="preserve"> </w:t>
+      </w:r>
+      <w:r>
+        <w:rPr>
+          <w:rFonts w:ascii="Times New Roman" w:hAnsi="Times New Roman" w:cs="Times New Roman"/>
+          <w:sz w:val="24"/>
+          <w:szCs w:val="24"/>
+        </w:rPr>
+        <w:t>fájlhoz</w:t>
+      </w:r>
+      <w:r>
+        <w:rPr>
+          <w:rFonts w:ascii="Times New Roman" w:hAnsi="Times New Roman" w:cs="Times New Roman"/>
+          <w:sz w:val="24"/>
+          <w:szCs w:val="24"/>
+        </w:rPr>
+        <w:t xml:space="preserve"> az alábbi módosításokat adtuk hozzá, hogy engedélyezzük a hozzáférést:</w:t>
+      </w:r>
+    </w:p>
+    <w:p>
+      <w:pPr>
+        <w:shd w:val="clear" w:color="auto" w:fill="FFFFFF"/>
+        <w:spacing w:after="0" w:line="285" w:lineRule="atLeast"/>
+        <w:rPr>
+          <w:rFonts w:ascii="Times New Roman" w:eastAsia="Times New Roman" w:hAnsi="Times New Roman" w:cs="Times New Roman"/>
+          <w:color w:val="202020"/>
+          <w:sz w:val="24"/>
+          <w:szCs w:val="24"/>
+          <w:lang w:eastAsia="hu-HU"/>
+        </w:rPr>
+      </w:pPr>
+      <w:proofErr w:type="spellStart"/>
+      <w:proofErr w:type="gramStart"/>
+      <w:r>
+        <w:rPr>
+          <w:rFonts w:ascii="Times New Roman" w:eastAsia="Times New Roman" w:hAnsi="Times New Roman" w:cs="Times New Roman"/>
+          <w:color w:val="795E26"/>
+          <w:sz w:val="24"/>
+          <w:szCs w:val="24"/>
+          <w:lang w:eastAsia="hu-HU"/>
+        </w:rPr>
+        <w:t>header</w:t>
+      </w:r>
+      <w:proofErr w:type="spellEnd"/>
+      <w:r>
+        <w:rPr>
+          <w:rFonts w:ascii="Times New Roman" w:eastAsia="Times New Roman" w:hAnsi="Times New Roman" w:cs="Times New Roman"/>
+          <w:color w:val="000000"/>
+          <w:sz w:val="24"/>
+          <w:szCs w:val="24"/>
+          <w:lang w:eastAsia="hu-HU"/>
+        </w:rPr>
+        <w:t>(</w:t>
+      </w:r>
+      <w:proofErr w:type="gramEnd"/>
+      <w:r>
+        <w:rPr>
+          <w:rFonts w:ascii="Times New Roman" w:eastAsia="Times New Roman" w:hAnsi="Times New Roman" w:cs="Times New Roman"/>
+          <w:color w:val="0A3069"/>
+          <w:sz w:val="24"/>
+          <w:szCs w:val="24"/>
+          <w:lang w:eastAsia="hu-HU"/>
+        </w:rPr>
+        <w:t>"</w:t>
+      </w:r>
+      <w:proofErr w:type="spellStart"/>
+      <w:r>
+        <w:rPr>
+          <w:rFonts w:ascii="Times New Roman" w:eastAsia="Times New Roman" w:hAnsi="Times New Roman" w:cs="Times New Roman"/>
+          <w:color w:val="0A3069"/>
+          <w:sz w:val="24"/>
+          <w:szCs w:val="24"/>
+          <w:lang w:eastAsia="hu-HU"/>
+        </w:rPr>
+        <w:t>Content-Type</w:t>
+      </w:r>
+      <w:proofErr w:type="spellEnd"/>
+      <w:r>
+        <w:rPr>
+          <w:rFonts w:ascii="Times New Roman" w:eastAsia="Times New Roman" w:hAnsi="Times New Roman" w:cs="Times New Roman"/>
+          <w:color w:val="0A3069"/>
+          <w:sz w:val="24"/>
+          <w:szCs w:val="24"/>
+          <w:lang w:eastAsia="hu-HU"/>
+        </w:rPr>
+        <w:t xml:space="preserve">: </w:t>
+      </w:r>
+      <w:proofErr w:type="spellStart"/>
+      <w:r>
+        <w:rPr>
+          <w:rFonts w:ascii="Times New Roman" w:eastAsia="Times New Roman" w:hAnsi="Times New Roman" w:cs="Times New Roman"/>
+          <w:color w:val="0A3069"/>
+          <w:sz w:val="24"/>
+          <w:szCs w:val="24"/>
+          <w:lang w:eastAsia="hu-HU"/>
+        </w:rPr>
+        <w:t>application</w:t>
+      </w:r>
+      <w:proofErr w:type="spellEnd"/>
+      <w:r>
+        <w:rPr>
+          <w:rFonts w:ascii="Times New Roman" w:eastAsia="Times New Roman" w:hAnsi="Times New Roman" w:cs="Times New Roman"/>
+          <w:color w:val="0A3069"/>
+          <w:sz w:val="24"/>
+          <w:szCs w:val="24"/>
+          <w:lang w:eastAsia="hu-HU"/>
+        </w:rPr>
+        <w:t>/</w:t>
+      </w:r>
+      <w:proofErr w:type="spellStart"/>
+      <w:r>
+        <w:rPr>
+          <w:rFonts w:ascii="Times New Roman" w:eastAsia="Times New Roman" w:hAnsi="Times New Roman" w:cs="Times New Roman"/>
+          <w:color w:val="0A3069"/>
+          <w:sz w:val="24"/>
+          <w:szCs w:val="24"/>
+          <w:lang w:eastAsia="hu-HU"/>
+        </w:rPr>
+        <w:t>json</w:t>
+      </w:r>
+      <w:proofErr w:type="spellEnd"/>
+      <w:r>
+        <w:rPr>
+          <w:rFonts w:ascii="Times New Roman" w:eastAsia="Times New Roman" w:hAnsi="Times New Roman" w:cs="Times New Roman"/>
+          <w:color w:val="0A3069"/>
+          <w:sz w:val="24"/>
+          <w:szCs w:val="24"/>
+          <w:lang w:eastAsia="hu-HU"/>
+        </w:rPr>
+        <w:t>"</w:t>
+      </w:r>
+      <w:r>
+        <w:rPr>
+          <w:rFonts w:ascii="Times New Roman" w:eastAsia="Times New Roman" w:hAnsi="Times New Roman" w:cs="Times New Roman"/>
+          <w:color w:val="000000"/>
+          <w:sz w:val="24"/>
+          <w:szCs w:val="24"/>
+          <w:lang w:eastAsia="hu-HU"/>
+        </w:rPr>
+        <w:t xml:space="preserve">); </w:t>
+      </w:r>
+    </w:p>
+    <w:p>
+      <w:pPr>
+        <w:shd w:val="clear" w:color="auto" w:fill="FFFFFF"/>
+        <w:spacing w:after="0" w:line="285" w:lineRule="atLeast"/>
+        <w:rPr>
+          <w:rFonts w:ascii="Times New Roman" w:eastAsia="Times New Roman" w:hAnsi="Times New Roman" w:cs="Times New Roman"/>
+          <w:color w:val="202020"/>
+          <w:sz w:val="24"/>
+          <w:szCs w:val="24"/>
+          <w:lang w:eastAsia="hu-HU"/>
+        </w:rPr>
+      </w:pPr>
+      <w:proofErr w:type="spellStart"/>
+      <w:proofErr w:type="gramStart"/>
+      <w:r>
+        <w:rPr>
+          <w:rFonts w:ascii="Times New Roman" w:eastAsia="Times New Roman" w:hAnsi="Times New Roman" w:cs="Times New Roman"/>
+          <w:color w:val="795E26"/>
+          <w:sz w:val="24"/>
+          <w:szCs w:val="24"/>
+          <w:lang w:eastAsia="hu-HU"/>
+        </w:rPr>
+        <w:t>header</w:t>
+      </w:r>
+      <w:proofErr w:type="spellEnd"/>
+      <w:r>
+        <w:rPr>
+          <w:rFonts w:ascii="Times New Roman" w:eastAsia="Times New Roman" w:hAnsi="Times New Roman" w:cs="Times New Roman"/>
+          <w:color w:val="000000"/>
+          <w:sz w:val="24"/>
+          <w:szCs w:val="24"/>
+          <w:lang w:eastAsia="hu-HU"/>
+        </w:rPr>
+        <w:t>(</w:t>
+      </w:r>
+      <w:proofErr w:type="gramEnd"/>
+      <w:r>
+        <w:rPr>
+          <w:rFonts w:ascii="Times New Roman" w:eastAsia="Times New Roman" w:hAnsi="Times New Roman" w:cs="Times New Roman"/>
+          <w:color w:val="0A3069"/>
+          <w:sz w:val="24"/>
+          <w:szCs w:val="24"/>
+          <w:lang w:eastAsia="hu-HU"/>
+        </w:rPr>
+        <w:t>"</w:t>
+      </w:r>
+      <w:proofErr w:type="spellStart"/>
+      <w:r>
+        <w:rPr>
+          <w:rFonts w:ascii="Times New Roman" w:eastAsia="Times New Roman" w:hAnsi="Times New Roman" w:cs="Times New Roman"/>
+          <w:color w:val="0A3069"/>
+          <w:sz w:val="24"/>
+          <w:szCs w:val="24"/>
+          <w:lang w:eastAsia="hu-HU"/>
+        </w:rPr>
+        <w:t>Access-Control-Allow-Origin</w:t>
+      </w:r>
+      <w:proofErr w:type="spellEnd"/>
+      <w:r>
+        <w:rPr>
+          <w:rFonts w:ascii="Times New Roman" w:eastAsia="Times New Roman" w:hAnsi="Times New Roman" w:cs="Times New Roman"/>
+          <w:color w:val="0A3069"/>
+          <w:sz w:val="24"/>
+          <w:szCs w:val="24"/>
+          <w:lang w:eastAsia="hu-HU"/>
+        </w:rPr>
+        <w:t>: *"</w:t>
+      </w:r>
+      <w:r>
+        <w:rPr>
+          <w:rFonts w:ascii="Times New Roman" w:eastAsia="Times New Roman" w:hAnsi="Times New Roman" w:cs="Times New Roman"/>
+          <w:color w:val="000000"/>
+          <w:sz w:val="24"/>
+          <w:szCs w:val="24"/>
+          <w:lang w:eastAsia="hu-HU"/>
+        </w:rPr>
+        <w:t>);</w:t>
+      </w:r>
+    </w:p>
+    <w:p>
+      <w:pPr>
+        <w:shd w:val="clear" w:color="auto" w:fill="FFFFFF"/>
+        <w:spacing w:after="0" w:line="285" w:lineRule="atLeast"/>
+        <w:rPr>
+          <w:rFonts w:ascii="Times New Roman" w:eastAsia="Times New Roman" w:hAnsi="Times New Roman" w:cs="Times New Roman"/>
+          <w:color w:val="202020"/>
+          <w:sz w:val="24"/>
+          <w:szCs w:val="24"/>
+          <w:lang w:eastAsia="hu-HU"/>
+        </w:rPr>
+      </w:pPr>
+      <w:proofErr w:type="spellStart"/>
+      <w:proofErr w:type="gramStart"/>
+      <w:r>
+        <w:rPr>
+          <w:rFonts w:ascii="Times New Roman" w:eastAsia="Times New Roman" w:hAnsi="Times New Roman" w:cs="Times New Roman"/>
+          <w:color w:val="795E26"/>
+          <w:sz w:val="24"/>
+          <w:szCs w:val="24"/>
+          <w:lang w:eastAsia="hu-HU"/>
+        </w:rPr>
+        <w:t>header</w:t>
+      </w:r>
+      <w:proofErr w:type="spellEnd"/>
+      <w:r>
+        <w:rPr>
+          <w:rFonts w:ascii="Times New Roman" w:eastAsia="Times New Roman" w:hAnsi="Times New Roman" w:cs="Times New Roman"/>
+          <w:color w:val="000000"/>
+          <w:sz w:val="24"/>
+          <w:szCs w:val="24"/>
+          <w:lang w:eastAsia="hu-HU"/>
+        </w:rPr>
+        <w:t>(</w:t>
+      </w:r>
+      <w:proofErr w:type="gramEnd"/>
+      <w:r>
+        <w:rPr>
+          <w:rFonts w:ascii="Times New Roman" w:eastAsia="Times New Roman" w:hAnsi="Times New Roman" w:cs="Times New Roman"/>
+          <w:color w:val="0A3069"/>
+          <w:sz w:val="24"/>
+          <w:szCs w:val="24"/>
+          <w:lang w:eastAsia="hu-HU"/>
+        </w:rPr>
+        <w:t>"</w:t>
+      </w:r>
+      <w:proofErr w:type="spellStart"/>
+      <w:r>
+        <w:rPr>
+          <w:rFonts w:ascii="Times New Roman" w:eastAsia="Times New Roman" w:hAnsi="Times New Roman" w:cs="Times New Roman"/>
+          <w:color w:val="0A3069"/>
+          <w:sz w:val="24"/>
+          <w:szCs w:val="24"/>
+          <w:lang w:eastAsia="hu-HU"/>
+        </w:rPr>
+        <w:t>Access-Control-Allow-Methods</w:t>
+      </w:r>
+      <w:proofErr w:type="spellEnd"/>
+      <w:r>
+        <w:rPr>
+          <w:rFonts w:ascii="Times New Roman" w:eastAsia="Times New Roman" w:hAnsi="Times New Roman" w:cs="Times New Roman"/>
+          <w:color w:val="0A3069"/>
+          <w:sz w:val="24"/>
+          <w:szCs w:val="24"/>
+          <w:lang w:eastAsia="hu-HU"/>
+        </w:rPr>
+        <w:t>: GET, POST, PUT, DELETE, OPTIONS"</w:t>
+      </w:r>
+      <w:r>
+        <w:rPr>
+          <w:rFonts w:ascii="Times New Roman" w:eastAsia="Times New Roman" w:hAnsi="Times New Roman" w:cs="Times New Roman"/>
+          <w:color w:val="000000"/>
+          <w:sz w:val="24"/>
+          <w:szCs w:val="24"/>
+          <w:lang w:eastAsia="hu-HU"/>
+        </w:rPr>
+        <w:t>);</w:t>
+      </w:r>
+    </w:p>
+    <w:p>
+      <w:pPr>
+        <w:shd w:val="clear" w:color="auto" w:fill="FFFFFF"/>
+        <w:spacing w:after="0" w:line="285" w:lineRule="atLeast"/>
+        <w:rPr>
+          <w:rFonts w:ascii="Times New Roman" w:eastAsia="Times New Roman" w:hAnsi="Times New Roman" w:cs="Times New Roman"/>
+          <w:color w:val="202020"/>
+          <w:sz w:val="24"/>
+          <w:szCs w:val="24"/>
+          <w:lang w:eastAsia="hu-HU"/>
+        </w:rPr>
+      </w:pPr>
+      <w:proofErr w:type="spellStart"/>
+      <w:proofErr w:type="gramStart"/>
+      <w:r>
+        <w:rPr>
+          <w:rFonts w:ascii="Times New Roman" w:eastAsia="Times New Roman" w:hAnsi="Times New Roman" w:cs="Times New Roman"/>
+          <w:color w:val="795E26"/>
+          <w:sz w:val="24"/>
+          <w:szCs w:val="24"/>
+          <w:lang w:eastAsia="hu-HU"/>
+        </w:rPr>
+        <w:t>header</w:t>
+      </w:r>
+      <w:proofErr w:type="spellEnd"/>
+      <w:r>
+        <w:rPr>
+          <w:rFonts w:ascii="Times New Roman" w:eastAsia="Times New Roman" w:hAnsi="Times New Roman" w:cs="Times New Roman"/>
+          <w:color w:val="000000"/>
+          <w:sz w:val="24"/>
+          <w:szCs w:val="24"/>
+          <w:lang w:eastAsia="hu-HU"/>
+        </w:rPr>
+        <w:t>(</w:t>
+      </w:r>
+      <w:proofErr w:type="gramEnd"/>
+      <w:r>
+        <w:rPr>
+          <w:rFonts w:ascii="Times New Roman" w:eastAsia="Times New Roman" w:hAnsi="Times New Roman" w:cs="Times New Roman"/>
+          <w:color w:val="0A3069"/>
+          <w:sz w:val="24"/>
+          <w:szCs w:val="24"/>
+          <w:lang w:eastAsia="hu-HU"/>
+        </w:rPr>
+        <w:t>"</w:t>
+      </w:r>
+      <w:proofErr w:type="spellStart"/>
+      <w:r>
+        <w:rPr>
+          <w:rFonts w:ascii="Times New Roman" w:eastAsia="Times New Roman" w:hAnsi="Times New Roman" w:cs="Times New Roman"/>
+          <w:color w:val="0A3069"/>
+          <w:sz w:val="24"/>
+          <w:szCs w:val="24"/>
+          <w:lang w:eastAsia="hu-HU"/>
+        </w:rPr>
+        <w:t>Access-Control-Allow-Headers</w:t>
+      </w:r>
+      <w:proofErr w:type="spellEnd"/>
+      <w:r>
+        <w:rPr>
+          <w:rFonts w:ascii="Times New Roman" w:eastAsia="Times New Roman" w:hAnsi="Times New Roman" w:cs="Times New Roman"/>
+          <w:color w:val="0A3069"/>
+          <w:sz w:val="24"/>
+          <w:szCs w:val="24"/>
+          <w:lang w:eastAsia="hu-HU"/>
+        </w:rPr>
+        <w:t xml:space="preserve">: </w:t>
+      </w:r>
+      <w:proofErr w:type="spellStart"/>
+      <w:r>
+        <w:rPr>
+          <w:rFonts w:ascii="Times New Roman" w:eastAsia="Times New Roman" w:hAnsi="Times New Roman" w:cs="Times New Roman"/>
+          <w:color w:val="0A3069"/>
+          <w:sz w:val="24"/>
+          <w:szCs w:val="24"/>
+          <w:lang w:eastAsia="hu-HU"/>
+        </w:rPr>
+        <w:t>Content-Type</w:t>
+      </w:r>
+      <w:proofErr w:type="spellEnd"/>
+      <w:r>
+        <w:rPr>
+          <w:rFonts w:ascii="Times New Roman" w:eastAsia="Times New Roman" w:hAnsi="Times New Roman" w:cs="Times New Roman"/>
+          <w:color w:val="0A3069"/>
+          <w:sz w:val="24"/>
+          <w:szCs w:val="24"/>
+          <w:lang w:eastAsia="hu-HU"/>
+        </w:rPr>
+        <w:t>"</w:t>
+      </w:r>
+      <w:r>
+        <w:rPr>
+          <w:rFonts w:ascii="Times New Roman" w:eastAsia="Times New Roman" w:hAnsi="Times New Roman" w:cs="Times New Roman"/>
+          <w:color w:val="000000"/>
+          <w:sz w:val="24"/>
+          <w:szCs w:val="24"/>
+          <w:lang w:eastAsia="hu-HU"/>
+        </w:rPr>
+        <w:t>);</w:t>
+      </w:r>
+    </w:p>
+    <w:p>
+      <w:pPr>
+        <w:rPr>
+          <w:rFonts w:ascii="Times New Roman" w:hAnsi="Times New Roman" w:cs="Times New Roman"/>
+          <w:sz w:val="24"/>
+          <w:szCs w:val="24"/>
+        </w:rPr>
+      </w:pPr>
+    </w:p>
+    <w:p>
+      <w:pPr>
+        <w:rPr>
+          <w:rFonts w:ascii="Times New Roman" w:hAnsi="Times New Roman" w:cs="Times New Roman"/>
+          <w:sz w:val="24"/>
+          <w:szCs w:val="24"/>
+        </w:rPr>
+      </w:pPr>
+      <w:r>
+        <w:rPr>
+          <w:rFonts w:ascii="Times New Roman" w:hAnsi="Times New Roman" w:cs="Times New Roman"/>
+          <w:sz w:val="24"/>
+          <w:szCs w:val="24"/>
+        </w:rPr>
+        <w:t xml:space="preserve">Illetve az </w:t>
+      </w:r>
+      <w:proofErr w:type="spellStart"/>
+      <w:r>
+        <w:rPr>
+          <w:rFonts w:ascii="Times New Roman" w:hAnsi="Times New Roman" w:cs="Times New Roman"/>
+          <w:sz w:val="24"/>
+          <w:szCs w:val="24"/>
+        </w:rPr>
+        <w:t>axios.jsx</w:t>
+      </w:r>
+      <w:proofErr w:type="spellEnd"/>
+      <w:r>
+        <w:rPr>
+          <w:rFonts w:ascii="Times New Roman" w:hAnsi="Times New Roman" w:cs="Times New Roman"/>
+          <w:sz w:val="24"/>
+          <w:szCs w:val="24"/>
+        </w:rPr>
+        <w:t xml:space="preserve"> fájlhoz a következőt pontosítottuk, hogy tudja, hogy melyik </w:t>
+      </w:r>
+      <w:proofErr w:type="spellStart"/>
+      <w:r>
+        <w:rPr>
+          <w:rFonts w:ascii="Times New Roman" w:hAnsi="Times New Roman" w:cs="Times New Roman"/>
+          <w:sz w:val="24"/>
+          <w:szCs w:val="24"/>
+        </w:rPr>
+        <w:t>porton</w:t>
+      </w:r>
+      <w:proofErr w:type="spellEnd"/>
+      <w:r>
+        <w:rPr>
+          <w:rFonts w:ascii="Times New Roman" w:hAnsi="Times New Roman" w:cs="Times New Roman"/>
+          <w:sz w:val="24"/>
+          <w:szCs w:val="24"/>
+        </w:rPr>
+        <w:t xml:space="preserve"> keresztül kell értelmeznie a php fájl-t:</w:t>
+      </w:r>
+    </w:p>
+    <w:p>
+      <w:pPr>
+        <w:shd w:val="clear" w:color="auto" w:fill="FFFFFF"/>
+        <w:spacing w:after="0" w:line="285" w:lineRule="atLeast"/>
+        <w:rPr>
+          <w:rFonts w:ascii="Times New Roman" w:eastAsia="Times New Roman" w:hAnsi="Times New Roman" w:cs="Times New Roman"/>
+          <w:color w:val="202020"/>
+          <w:sz w:val="24"/>
+          <w:szCs w:val="24"/>
+          <w:lang w:eastAsia="hu-HU"/>
+        </w:rPr>
+      </w:pPr>
+      <w:proofErr w:type="spellStart"/>
+      <w:r>
+        <w:rPr>
+          <w:rFonts w:ascii="Times New Roman" w:eastAsia="Times New Roman" w:hAnsi="Times New Roman" w:cs="Times New Roman"/>
+          <w:color w:val="CF222E"/>
+          <w:sz w:val="24"/>
+          <w:szCs w:val="24"/>
+          <w:lang w:eastAsia="hu-HU"/>
+        </w:rPr>
+        <w:t>const</w:t>
+      </w:r>
+      <w:proofErr w:type="spellEnd"/>
+      <w:r>
+        <w:rPr>
+          <w:rFonts w:ascii="Times New Roman" w:eastAsia="Times New Roman" w:hAnsi="Times New Roman" w:cs="Times New Roman"/>
+          <w:color w:val="1F2328"/>
+          <w:sz w:val="24"/>
+          <w:szCs w:val="24"/>
+          <w:lang w:eastAsia="hu-HU"/>
+        </w:rPr>
+        <w:t xml:space="preserve"> </w:t>
+      </w:r>
+      <w:r>
+        <w:rPr>
+          <w:rFonts w:ascii="Times New Roman" w:eastAsia="Times New Roman" w:hAnsi="Times New Roman" w:cs="Times New Roman"/>
+          <w:color w:val="0550AE"/>
+          <w:sz w:val="24"/>
+          <w:szCs w:val="24"/>
+          <w:lang w:eastAsia="hu-HU"/>
+        </w:rPr>
+        <w:t>API_URL</w:t>
+      </w:r>
+      <w:r>
+        <w:rPr>
+          <w:rFonts w:ascii="Times New Roman" w:eastAsia="Times New Roman" w:hAnsi="Times New Roman" w:cs="Times New Roman"/>
+          <w:color w:val="1F2328"/>
+          <w:sz w:val="24"/>
+          <w:szCs w:val="24"/>
+          <w:lang w:eastAsia="hu-HU"/>
+        </w:rPr>
+        <w:t xml:space="preserve"> </w:t>
+      </w:r>
+      <w:r>
+        <w:rPr>
+          <w:rFonts w:ascii="Times New Roman" w:eastAsia="Times New Roman" w:hAnsi="Times New Roman" w:cs="Times New Roman"/>
+          <w:color w:val="000000"/>
+          <w:sz w:val="24"/>
+          <w:szCs w:val="24"/>
+          <w:lang w:eastAsia="hu-HU"/>
+        </w:rPr>
+        <w:t>=</w:t>
+      </w:r>
+      <w:r>
+        <w:rPr>
+          <w:rFonts w:ascii="Times New Roman" w:eastAsia="Times New Roman" w:hAnsi="Times New Roman" w:cs="Times New Roman"/>
+          <w:color w:val="1F2328"/>
+          <w:sz w:val="24"/>
+          <w:szCs w:val="24"/>
+          <w:lang w:eastAsia="hu-HU"/>
+        </w:rPr>
+        <w:t xml:space="preserve"> </w:t>
+      </w:r>
+      <w:r>
+        <w:rPr>
+          <w:rFonts w:ascii="Times New Roman" w:eastAsia="Times New Roman" w:hAnsi="Times New Roman" w:cs="Times New Roman"/>
+          <w:color w:val="0A3069"/>
+          <w:sz w:val="24"/>
+          <w:szCs w:val="24"/>
+          <w:lang w:eastAsia="hu-HU"/>
+        </w:rPr>
+        <w:t>"http://localhost:8000/read.php"</w:t>
+      </w:r>
+      <w:r>
+        <w:rPr>
+          <w:rFonts w:ascii="Times New Roman" w:eastAsia="Times New Roman" w:hAnsi="Times New Roman" w:cs="Times New Roman"/>
+          <w:color w:val="1F2328"/>
+          <w:sz w:val="24"/>
+          <w:szCs w:val="24"/>
+          <w:lang w:eastAsia="hu-HU"/>
+        </w:rPr>
+        <w:t>;</w:t>
+      </w:r>
+    </w:p>
+    <w:p>
+      <w:pPr>
+        <w:rPr>
+          <w:rFonts w:ascii="Times New Roman" w:hAnsi="Times New Roman" w:cs="Times New Roman"/>
+          <w:sz w:val="24"/>
+          <w:szCs w:val="24"/>
+        </w:rPr>
+      </w:pPr>
+    </w:p>
+    <w:p>
+      <w:pPr>
+        <w:shd w:val="clear" w:color="auto" w:fill="FFFFFF"/>
+        <w:spacing w:line="285" w:lineRule="atLeast"/>
+        <w:rPr>
+          <w:rFonts w:ascii="Times New Roman" w:hAnsi="Times New Roman" w:cs="Times New Roman"/>
+          <w:sz w:val="24"/>
+          <w:szCs w:val="24"/>
+        </w:rPr>
+      </w:pPr>
+      <w:r>
+        <w:rPr>
+          <w:rFonts w:ascii="Times New Roman" w:hAnsi="Times New Roman" w:cs="Times New Roman"/>
+          <w:sz w:val="24"/>
+          <w:szCs w:val="24"/>
+        </w:rPr>
+        <w:t xml:space="preserve">Itt még az az ötletem támadt, hogy ne csak szimplán egy szövegként írja ki az oldal, hogy sikeres volt valamilyen művelet, hanem inkább a böngésző küldjön egy értesítést, ami nem zavarja meg a weblap felépítését. Illetve ebben a feladatrészben jutott az is eszünkbe, hogy átírjuk az angol szöveget magyar szövegre a </w:t>
+      </w:r>
+      <w:proofErr w:type="spellStart"/>
+      <w:r>
+        <w:rPr>
+          <w:rFonts w:ascii="Times New Roman" w:hAnsi="Times New Roman" w:cs="Times New Roman"/>
+          <w:sz w:val="24"/>
+          <w:szCs w:val="24"/>
+        </w:rPr>
+        <w:t>read.php-ban</w:t>
+      </w:r>
+      <w:proofErr w:type="spellEnd"/>
+      <w:r>
+        <w:rPr>
+          <w:rFonts w:ascii="Times New Roman" w:hAnsi="Times New Roman" w:cs="Times New Roman"/>
+          <w:sz w:val="24"/>
+          <w:szCs w:val="24"/>
+        </w:rPr>
+        <w:t xml:space="preserve">, </w:t>
+      </w:r>
+      <w:proofErr w:type="spellStart"/>
+      <w:r>
+        <w:rPr>
+          <w:rFonts w:ascii="Times New Roman" w:hAnsi="Times New Roman" w:cs="Times New Roman"/>
+          <w:sz w:val="24"/>
+          <w:szCs w:val="24"/>
+        </w:rPr>
+        <w:t>pl</w:t>
+      </w:r>
+      <w:proofErr w:type="spellEnd"/>
+      <w:r>
+        <w:rPr>
+          <w:rFonts w:ascii="Times New Roman" w:hAnsi="Times New Roman" w:cs="Times New Roman"/>
+          <w:sz w:val="24"/>
+          <w:szCs w:val="24"/>
+        </w:rPr>
+        <w:t xml:space="preserve">: </w:t>
+      </w:r>
+    </w:p>
+    <w:p>
+      <w:pPr>
+        <w:shd w:val="clear" w:color="auto" w:fill="FFFFFF"/>
+        <w:spacing w:line="285" w:lineRule="atLeast"/>
+        <w:rPr>
+          <w:rFonts w:ascii="Times New Roman" w:eastAsia="Times New Roman" w:hAnsi="Times New Roman" w:cs="Times New Roman"/>
+          <w:color w:val="202020"/>
+          <w:sz w:val="24"/>
+          <w:szCs w:val="24"/>
+          <w:lang w:eastAsia="hu-HU"/>
+        </w:rPr>
+      </w:pPr>
+      <w:proofErr w:type="spellStart"/>
+      <w:r>
+        <w:rPr>
+          <w:rFonts w:ascii="Times New Roman" w:eastAsia="Times New Roman" w:hAnsi="Times New Roman" w:cs="Times New Roman"/>
+          <w:color w:val="795E26"/>
+          <w:sz w:val="24"/>
+          <w:szCs w:val="24"/>
+          <w:lang w:eastAsia="hu-HU"/>
+        </w:rPr>
+        <w:t>echo</w:t>
+      </w:r>
+      <w:proofErr w:type="spellEnd"/>
+      <w:r>
+        <w:rPr>
+          <w:rFonts w:ascii="Times New Roman" w:eastAsia="Times New Roman" w:hAnsi="Times New Roman" w:cs="Times New Roman"/>
+          <w:color w:val="000000"/>
+          <w:sz w:val="24"/>
+          <w:szCs w:val="24"/>
+          <w:lang w:eastAsia="hu-HU"/>
+        </w:rPr>
+        <w:t xml:space="preserve"> </w:t>
+      </w:r>
+      <w:proofErr w:type="spellStart"/>
+      <w:r>
+        <w:rPr>
+          <w:rFonts w:ascii="Times New Roman" w:eastAsia="Times New Roman" w:hAnsi="Times New Roman" w:cs="Times New Roman"/>
+          <w:color w:val="795E26"/>
+          <w:sz w:val="24"/>
+          <w:szCs w:val="24"/>
+          <w:lang w:eastAsia="hu-HU"/>
+        </w:rPr>
+        <w:t>json</w:t>
+      </w:r>
+      <w:proofErr w:type="spellEnd"/>
+      <w:r>
+        <w:rPr>
+          <w:rFonts w:ascii="Times New Roman" w:eastAsia="Times New Roman" w:hAnsi="Times New Roman" w:cs="Times New Roman"/>
+          <w:color w:val="795E26"/>
+          <w:sz w:val="24"/>
+          <w:szCs w:val="24"/>
+          <w:lang w:eastAsia="hu-HU"/>
+        </w:rPr>
+        <w:t>_</w:t>
+      </w:r>
+      <w:proofErr w:type="spellStart"/>
+      <w:proofErr w:type="gramStart"/>
+      <w:r>
+        <w:rPr>
+          <w:rFonts w:ascii="Times New Roman" w:eastAsia="Times New Roman" w:hAnsi="Times New Roman" w:cs="Times New Roman"/>
+          <w:color w:val="795E26"/>
+          <w:sz w:val="24"/>
+          <w:szCs w:val="24"/>
+          <w:lang w:eastAsia="hu-HU"/>
+        </w:rPr>
+        <w:t>encode</w:t>
+      </w:r>
+      <w:proofErr w:type="spellEnd"/>
+      <w:r>
+        <w:rPr>
+          <w:rFonts w:ascii="Times New Roman" w:eastAsia="Times New Roman" w:hAnsi="Times New Roman" w:cs="Times New Roman"/>
+          <w:color w:val="000000"/>
+          <w:sz w:val="24"/>
+          <w:szCs w:val="24"/>
+          <w:lang w:eastAsia="hu-HU"/>
+        </w:rPr>
+        <w:t>(</w:t>
+      </w:r>
+      <w:proofErr w:type="gramEnd"/>
+      <w:r>
+        <w:rPr>
+          <w:rFonts w:ascii="Times New Roman" w:eastAsia="Times New Roman" w:hAnsi="Times New Roman" w:cs="Times New Roman"/>
+          <w:color w:val="000000"/>
+          <w:sz w:val="24"/>
+          <w:szCs w:val="24"/>
+          <w:lang w:eastAsia="hu-HU"/>
+        </w:rPr>
+        <w:t>[</w:t>
+      </w:r>
+      <w:r>
+        <w:rPr>
+          <w:rFonts w:ascii="Times New Roman" w:eastAsia="Times New Roman" w:hAnsi="Times New Roman" w:cs="Times New Roman"/>
+          <w:color w:val="0A3069"/>
+          <w:sz w:val="24"/>
+          <w:szCs w:val="24"/>
+          <w:lang w:eastAsia="hu-HU"/>
+        </w:rPr>
+        <w:t>'status'</w:t>
+      </w:r>
+      <w:r>
+        <w:rPr>
+          <w:rFonts w:ascii="Times New Roman" w:eastAsia="Times New Roman" w:hAnsi="Times New Roman" w:cs="Times New Roman"/>
+          <w:color w:val="000000"/>
+          <w:sz w:val="24"/>
+          <w:szCs w:val="24"/>
+          <w:lang w:eastAsia="hu-HU"/>
+        </w:rPr>
+        <w:t xml:space="preserve"> =&gt; </w:t>
+      </w:r>
+      <w:r>
+        <w:rPr>
+          <w:rFonts w:ascii="Times New Roman" w:eastAsia="Times New Roman" w:hAnsi="Times New Roman" w:cs="Times New Roman"/>
+          <w:color w:val="0A3069"/>
+          <w:sz w:val="24"/>
+          <w:szCs w:val="24"/>
+          <w:lang w:eastAsia="hu-HU"/>
+        </w:rPr>
+        <w:t>'Sikeres létrehozás!'</w:t>
+      </w:r>
+      <w:r>
+        <w:rPr>
+          <w:rFonts w:ascii="Times New Roman" w:eastAsia="Times New Roman" w:hAnsi="Times New Roman" w:cs="Times New Roman"/>
+          <w:color w:val="000000"/>
+          <w:sz w:val="24"/>
+          <w:szCs w:val="24"/>
+          <w:lang w:eastAsia="hu-HU"/>
+        </w:rPr>
+        <w:t>]);</w:t>
+      </w:r>
+    </w:p>
+    <w:p>
+      <w:pPr>
+        <w:rPr>
+          <w:rFonts w:ascii="Times New Roman" w:hAnsi="Times New Roman" w:cs="Times New Roman"/>
+          <w:sz w:val="24"/>
+          <w:szCs w:val="24"/>
+        </w:rPr>
+      </w:pPr>
     </w:p>
     <w:sectPr>
       <w:pgSz w:w="11906" w:h="16838"/>

</xml_diff>